<commit_message>
Complete the résumé with Joseph's details and export the final PDF
Fill resume_data.json with the confirmed email, phone, location, school
name, academic completion date, pending certificates, passport status,
nationality, date of birth, languages and availability. Let both builders
render supplied values as plain text and fall back to placeholders or
form fields only for blanks; move the completion date to its own line in
the PDF builder when the institution name is long. Export the final PDF
from the Word file, remove the now-redundant fillable draft, and update
the guidelines with the details on file and the document updates still
pending.

Co-Authored-By: Claude Fable 5.1 <noreply@anthropic.com>
Claude-Session: https://claude.ai/code/session_015fXf797xk1nqQuRvhm3AkH
</commit_message>
<xml_diff>
--- a/resume/Joseph_Mmanuel_Castillo_Resume.docx
+++ b/resume/Joseph_Mmanuel_Castillo_Resume.docx
@@ -57,7 +57,7 @@
           <w:sz w:val="21"/>
           <w:szCs w:val="21"/>
         </w:rPr>
-        <w:t xml:space="preserve">filemy77@gmail.com</w:t>
+        <w:t xml:space="preserve">filesmy77@gmail.com</w:t>
       </w:r>
       <w:r>
         <w:rPr>
@@ -78,13 +78,10 @@
       <w:r>
         <w:rPr>
           <w:rFonts w:ascii="Calibri" w:cs="Calibri" w:eastAsia="Calibri" w:hAnsi="Calibri"/>
-          <w:color w:val="7F6000"/>
-          <w:sz w:val="21"/>
-          <w:szCs w:val="21"/>
-          <w:highlight w:val="yellow"/>
-          <w:highlightCs w:val="yellow"/>
-        </w:rPr>
-        <w:t xml:space="preserve">[Phone number incl. country code]</w:t>
+          <w:sz w:val="21"/>
+          <w:szCs w:val="21"/>
+        </w:rPr>
+        <w:t xml:space="preserve">+63 962 081 9151</w:t>
       </w:r>
       <w:r>
         <w:rPr>
@@ -105,13 +102,10 @@
       <w:r>
         <w:rPr>
           <w:rFonts w:ascii="Calibri" w:cs="Calibri" w:eastAsia="Calibri" w:hAnsi="Calibri"/>
-          <w:color w:val="7F6000"/>
-          <w:sz w:val="21"/>
-          <w:szCs w:val="21"/>
-          <w:highlight w:val="yellow"/>
-          <w:highlightCs w:val="yellow"/>
-        </w:rPr>
-        <w:t xml:space="preserve">[City, Country]</w:t>
+          <w:sz w:val="21"/>
+          <w:szCs w:val="21"/>
+        </w:rPr>
+        <w:t xml:space="preserve">General Trias, Cavite, Philippines</w:t>
       </w:r>
     </w:p>
     <w:p>
@@ -145,7 +139,7 @@
           <w:sz w:val="21"/>
           <w:szCs w:val="21"/>
         </w:rPr>
-        <w:t xml:space="preserve">Completed the academic requirements of the Bachelor of Science in Marine Transportation (BSMT) program at PNTC. Seeking a first shipboard placement to complete the required 12 months of approved onboard training. First-time cadet available for international Deck Cadet, Deck Trainee or Apprentice Mate positions that offer paid onboard training.</w:t>
+        <w:t xml:space="preserve">Completed the academic requirements of the Bachelor of Science in Marine Transportation (BSMT) program at PNTC Colleges, Dasmariñas City, Cavite. Seeking a first shipboard placement to complete the required 12 months of approved onboard training. First-time cadet available for international Deck Cadet, Deck Trainee or Apprentice Mate positions that offer paid onboard training.</w:t>
       </w:r>
     </w:p>
     <w:p>
@@ -183,7 +177,7 @@
           <w:sz w:val="21"/>
           <w:szCs w:val="21"/>
         </w:rPr>
-        <w:t xml:space="preserve">PNTC</w:t>
+        <w:t xml:space="preserve">PNTC Colleges, Dasmariñas City, Cavite, Philippines</w:t>
       </w:r>
       <w:r>
         <w:rPr>
@@ -205,13 +199,10 @@
       <w:r>
         <w:rPr>
           <w:rFonts w:ascii="Calibri" w:cs="Calibri" w:eastAsia="Calibri" w:hAnsi="Calibri"/>
-          <w:color w:val="7F6000"/>
-          <w:sz w:val="21"/>
-          <w:szCs w:val="21"/>
-          <w:highlight w:val="yellow"/>
-          <w:highlightCs w:val="yellow"/>
-        </w:rPr>
-        <w:t xml:space="preserve">[Month Year]</w:t>
+          <w:sz w:val="21"/>
+          <w:szCs w:val="21"/>
+        </w:rPr>
+        <w:t xml:space="preserve">17 September 2026</w:t>
       </w:r>
     </w:p>
     <w:p>
@@ -300,7 +291,7 @@
           <w:sz w:val="21"/>
           <w:szCs w:val="21"/>
         </w:rPr>
-        <w:t xml:space="preserve">Training certificates: awaiting release. Certificate details will be added upon issuance.</w:t>
+        <w:t xml:space="preserve">Training certificates awaiting release: Seafarer with Designated Security Duties (SDSD) and Personal Safety and Social Responsibilities (PSSR). Certificate details will be added upon issuance.</w:t>
       </w:r>
     </w:p>
     <w:p>
@@ -323,26 +314,6 @@
     </w:p>
     <w:p>
       <w:pPr>
-        <w:pBdr>
-          <w:bottom w:val="single" w:color="1F3A5F" w:sz="8" w:space="2"/>
-        </w:pBdr>
-        <w:spacing w:after="80" w:before="220"/>
-      </w:pPr>
-      <w:r>
-        <w:rPr>
-          <w:rFonts w:ascii="Calibri" w:cs="Calibri" w:eastAsia="Calibri" w:hAnsi="Calibri"/>
-          <w:b/>
-          <w:bCs/>
-          <w:color w:val="1F3A5F"/>
-          <w:spacing w:val="20"/>
-          <w:sz w:val="22"/>
-          <w:szCs w:val="22"/>
-        </w:rPr>
-        <w:t xml:space="preserve">SEA SERVICE</w:t>
-      </w:r>
-    </w:p>
-    <w:p>
-      <w:pPr>
         <w:pStyle w:val="ListParagraph"/>
         <w:numPr>
           <w:ilvl w:val="0"/>
@@ -356,7 +327,7 @@
           <w:sz w:val="21"/>
           <w:szCs w:val="21"/>
         </w:rPr>
-        <w:t xml:space="preserve">No prior sea service. First-time cadet seeking an initial shipboard placement for the 12-month approved onboard training period.</w:t>
+        <w:t xml:space="preserve">Passport: applied for; awaiting release.</w:t>
       </w:r>
     </w:p>
     <w:p>
@@ -376,6 +347,44 @@
           <w:sz w:val="22"/>
           <w:szCs w:val="22"/>
         </w:rPr>
+        <w:t xml:space="preserve">SEA SERVICE</w:t>
+      </w:r>
+    </w:p>
+    <w:p>
+      <w:pPr>
+        <w:pStyle w:val="ListParagraph"/>
+        <w:numPr>
+          <w:ilvl w:val="0"/>
+          <w:numId w:val="2"/>
+        </w:numPr>
+        <w:spacing w:after="40"/>
+      </w:pPr>
+      <w:r>
+        <w:rPr>
+          <w:rFonts w:ascii="Calibri" w:cs="Calibri" w:eastAsia="Calibri" w:hAnsi="Calibri"/>
+          <w:sz w:val="21"/>
+          <w:szCs w:val="21"/>
+        </w:rPr>
+        <w:t xml:space="preserve">No prior sea service. First-time cadet seeking an initial shipboard placement for the 12-month approved onboard training period.</w:t>
+      </w:r>
+    </w:p>
+    <w:p>
+      <w:pPr>
+        <w:pBdr>
+          <w:bottom w:val="single" w:color="1F3A5F" w:sz="8" w:space="2"/>
+        </w:pBdr>
+        <w:spacing w:after="80" w:before="220"/>
+      </w:pPr>
+      <w:r>
+        <w:rPr>
+          <w:rFonts w:ascii="Calibri" w:cs="Calibri" w:eastAsia="Calibri" w:hAnsi="Calibri"/>
+          <w:b/>
+          <w:bCs/>
+          <w:color w:val="1F3A5F"/>
+          <w:spacing w:val="20"/>
+          <w:sz w:val="22"/>
+          <w:szCs w:val="22"/>
+        </w:rPr>
         <w:t xml:space="preserve">PERSONAL DETAILS</w:t>
       </w:r>
     </w:p>
@@ -408,13 +417,10 @@
       <w:r>
         <w:rPr>
           <w:rFonts w:ascii="Calibri" w:cs="Calibri" w:eastAsia="Calibri" w:hAnsi="Calibri"/>
-          <w:color w:val="7F6000"/>
-          <w:sz w:val="21"/>
-          <w:szCs w:val="21"/>
-          <w:highlight w:val="yellow"/>
-          <w:highlightCs w:val="yellow"/>
-        </w:rPr>
-        <w:t xml:space="preserve">[Nationality]</w:t>
+          <w:sz w:val="21"/>
+          <w:szCs w:val="21"/>
+        </w:rPr>
+        <w:t xml:space="preserve">Filipino</w:t>
       </w:r>
     </w:p>
     <w:p>
@@ -446,13 +452,10 @@
       <w:r>
         <w:rPr>
           <w:rFonts w:ascii="Calibri" w:cs="Calibri" w:eastAsia="Calibri" w:hAnsi="Calibri"/>
-          <w:color w:val="7F6000"/>
-          <w:sz w:val="21"/>
-          <w:szCs w:val="21"/>
-          <w:highlight w:val="yellow"/>
-          <w:highlightCs w:val="yellow"/>
-        </w:rPr>
-        <w:t xml:space="preserve">[DD Month YYYY]</w:t>
+          <w:sz w:val="21"/>
+          <w:szCs w:val="21"/>
+        </w:rPr>
+        <w:t xml:space="preserve">30 January 2003</w:t>
       </w:r>
     </w:p>
     <w:p>
@@ -471,7 +474,7 @@
           <w:sz w:val="21"/>
           <w:szCs w:val="21"/>
         </w:rPr>
-        <w:t xml:space="preserve">Passport</w:t>
+        <w:t xml:space="preserve">Languages</w:t>
       </w:r>
       <w:r>
         <w:rPr>
@@ -484,13 +487,10 @@
       <w:r>
         <w:rPr>
           <w:rFonts w:ascii="Calibri" w:cs="Calibri" w:eastAsia="Calibri" w:hAnsi="Calibri"/>
-          <w:color w:val="7F6000"/>
-          <w:sz w:val="21"/>
-          <w:szCs w:val="21"/>
-          <w:highlight w:val="yellow"/>
-          <w:highlightCs w:val="yellow"/>
-        </w:rPr>
-        <w:t xml:space="preserve">[Held / Not yet held; validity]</w:t>
+          <w:sz w:val="21"/>
+          <w:szCs w:val="21"/>
+        </w:rPr>
+        <w:t xml:space="preserve">English, Tagalog</w:t>
       </w:r>
     </w:p>
     <w:p>
@@ -509,7 +509,7 @@
           <w:sz w:val="21"/>
           <w:szCs w:val="21"/>
         </w:rPr>
-        <w:t xml:space="preserve">Languages</w:t>
+        <w:t xml:space="preserve">Available from</w:t>
       </w:r>
       <w:r>
         <w:rPr>
@@ -522,51 +522,10 @@
       <w:r>
         <w:rPr>
           <w:rFonts w:ascii="Calibri" w:cs="Calibri" w:eastAsia="Calibri" w:hAnsi="Calibri"/>
-          <w:color w:val="7F6000"/>
-          <w:sz w:val="21"/>
-          <w:szCs w:val="21"/>
-          <w:highlight w:val="yellow"/>
-          <w:highlightCs w:val="yellow"/>
-        </w:rPr>
-        <w:t xml:space="preserve">[Languages spoken]</w:t>
-      </w:r>
-    </w:p>
-    <w:p>
-      <w:pPr>
-        <w:tabs>
-          <w:tab w:val="left" w:pos="2154"/>
-        </w:tabs>
-        <w:spacing w:after="40"/>
-      </w:pPr>
-      <w:r>
-        <w:rPr>
-          <w:rFonts w:ascii="Calibri" w:cs="Calibri" w:eastAsia="Calibri" w:hAnsi="Calibri"/>
-          <w:b/>
-          <w:bCs/>
-          <w:color w:val="555555"/>
-          <w:sz w:val="21"/>
-          <w:szCs w:val="21"/>
-        </w:rPr>
-        <w:t xml:space="preserve">Available from</w:t>
-      </w:r>
-      <w:r>
-        <w:rPr>
-          <w:rFonts w:ascii="Calibri" w:cs="Calibri" w:eastAsia="Calibri" w:hAnsi="Calibri"/>
-          <w:sz w:val="21"/>
-          <w:szCs w:val="21"/>
-        </w:rPr>
-        <w:t xml:space="preserve">	</w:t>
-      </w:r>
-      <w:r>
-        <w:rPr>
-          <w:rFonts w:ascii="Calibri" w:cs="Calibri" w:eastAsia="Calibri" w:hAnsi="Calibri"/>
-          <w:color w:val="7F6000"/>
-          <w:sz w:val="21"/>
-          <w:szCs w:val="21"/>
-          <w:highlight w:val="yellow"/>
-          <w:highlightCs w:val="yellow"/>
-        </w:rPr>
-        <w:t xml:space="preserve">[Date available to join]</w:t>
+          <w:sz w:val="21"/>
+          <w:szCs w:val="21"/>
+        </w:rPr>
+        <w:t xml:space="preserve">Immediately, as soon as a placement is offered</w:t>
       </w:r>
     </w:p>
     <w:p>

</xml_diff>